<commit_message>
Add Work Interruptions task, telehealth question, Education rename, appendices cache fix
- Task type: Work Interruptions/ Miscellaneous/ Non-ASP time (DB constraint + activity)
- Education - Providing Education -> Education - Providing Education/Teaching
- Profile: telehealth ASP question (provides/receives/none) before SAAR
- Appendices: cache: no-store for fresh doc load; updated Appendices List.docx
- Database migrations and scripts for task constraint updates

Made-with: Cursor
</commit_message>
<xml_diff>
--- a/public/Appendices List.docx
+++ b/public/Appendices List.docx
@@ -948,6 +948,39 @@
           </w:p>
           <w:p>
             <w:pPr>
+              <w:pStyle w:val="ListParagraph"/>
+              <w:numPr>
+                <w:ilvl w:val="0"/>
+                <w:numId w:val="7"/>
+              </w:numPr>
+              <w:spacing w:line="276" w:lineRule="auto"/>
+              <w:rPr>
+                <w:rFonts w:ascii="Times New Roman" w:hAnsi="Times New Roman" w:eastAsia="Times New Roman" w:cs="Times New Roman"/>
+                <w:sz w:val="22"/>
+                <w:szCs w:val="22"/>
+              </w:rPr>
+            </w:pPr>
+            <w:r>
+              <w:rPr>
+                <w:rFonts w:ascii="Times New Roman" w:hAnsi="Times New Roman" w:eastAsia="Times New Roman" w:cs="Times New Roman"/>
+                <w:sz w:val="22"/>
+                <w:szCs w:val="22"/>
+              </w:rPr>
+              <w:t>“handshake” ASP rounds</w:t>
+            </w:r>
+          </w:p>
+          <w:p>
+            <w:pPr>
+              <w:spacing w:line="276" w:lineRule="auto"/>
+              <w:rPr>
+                <w:rFonts w:ascii="Times New Roman" w:hAnsi="Times New Roman" w:eastAsia="Times New Roman" w:cs="Times New Roman"/>
+                <w:sz w:val="22"/>
+                <w:szCs w:val="22"/>
+              </w:rPr>
+            </w:pPr>
+          </w:p>
+          <w:p>
+            <w:pPr>
               <w:spacing w:line="276" w:lineRule="auto"/>
               <w:rPr>
                 <w:rFonts w:ascii="Times New Roman" w:hAnsi="Times New Roman" w:eastAsia="Times New Roman" w:cs="Times New Roman"/>
@@ -2532,6 +2565,14 @@
               </w:rPr>
               <w:t>Education – Providing Education</w:t>
             </w:r>
+            <w:r>
+              <w:rPr>
+                <w:rFonts w:ascii="Times New Roman" w:hAnsi="Times New Roman" w:eastAsia="Times New Roman" w:cs="Times New Roman"/>
+                <w:sz w:val="22"/>
+                <w:szCs w:val="22"/>
+              </w:rPr>
+              <w:t>/Teaching</w:t>
+            </w:r>
           </w:p>
         </w:tc>
         <w:tc>
@@ -2563,7 +2604,79 @@
                 <w:sz w:val="22"/>
                 <w:szCs w:val="22"/>
               </w:rPr>
-              <w:t xml:space="preserve">Developing educational content and educating clinicians about antimicrobial stewardship programs, including antimicrobial resistance and </w:t>
+              <w:t xml:space="preserve">Planning, </w:t>
+            </w:r>
+            <w:r>
+              <w:rPr>
+                <w:rFonts w:ascii="Times New Roman" w:hAnsi="Times New Roman" w:eastAsia="Times New Roman" w:cs="Times New Roman"/>
+                <w:sz w:val="22"/>
+                <w:szCs w:val="22"/>
+              </w:rPr>
+              <w:t>d</w:t>
+            </w:r>
+            <w:r>
+              <w:rPr>
+                <w:rFonts w:ascii="Times New Roman" w:hAnsi="Times New Roman" w:eastAsia="Times New Roman" w:cs="Times New Roman"/>
+                <w:sz w:val="22"/>
+                <w:szCs w:val="22"/>
+              </w:rPr>
+              <w:t>eveloping</w:t>
+            </w:r>
+            <w:r>
+              <w:rPr>
+                <w:rFonts w:ascii="Times New Roman" w:hAnsi="Times New Roman" w:eastAsia="Times New Roman" w:cs="Times New Roman"/>
+                <w:sz w:val="22"/>
+                <w:szCs w:val="22"/>
+              </w:rPr>
+              <w:t xml:space="preserve"> </w:t>
+            </w:r>
+            <w:r>
+              <w:rPr>
+                <w:rFonts w:ascii="Times New Roman" w:hAnsi="Times New Roman" w:eastAsia="Times New Roman" w:cs="Times New Roman"/>
+                <w:sz w:val="22"/>
+                <w:szCs w:val="22"/>
+              </w:rPr>
+              <w:t xml:space="preserve">and/or delivering </w:t>
+            </w:r>
+            <w:r>
+              <w:rPr>
+                <w:rFonts w:ascii="Times New Roman" w:hAnsi="Times New Roman" w:eastAsia="Times New Roman" w:cs="Times New Roman"/>
+                <w:sz w:val="22"/>
+                <w:szCs w:val="22"/>
+              </w:rPr>
+              <w:t>education</w:t>
+            </w:r>
+            <w:r>
+              <w:rPr>
+                <w:rFonts w:ascii="Times New Roman" w:hAnsi="Times New Roman" w:eastAsia="Times New Roman" w:cs="Times New Roman"/>
+                <w:sz w:val="22"/>
+                <w:szCs w:val="22"/>
+              </w:rPr>
+              <w:t xml:space="preserve"> to</w:t>
+            </w:r>
+            <w:r>
+              <w:rPr>
+                <w:rFonts w:ascii="Times New Roman" w:hAnsi="Times New Roman" w:eastAsia="Times New Roman" w:cs="Times New Roman"/>
+                <w:sz w:val="22"/>
+                <w:szCs w:val="22"/>
+              </w:rPr>
+              <w:t xml:space="preserve"> clinicians about </w:t>
+            </w:r>
+            <w:r>
+              <w:rPr>
+                <w:rFonts w:ascii="Times New Roman" w:hAnsi="Times New Roman" w:eastAsia="Times New Roman" w:cs="Times New Roman"/>
+                <w:sz w:val="22"/>
+                <w:szCs w:val="22"/>
+              </w:rPr>
+              <w:t>ASPs</w:t>
+            </w:r>
+            <w:r>
+              <w:rPr>
+                <w:rFonts w:ascii="Times New Roman" w:hAnsi="Times New Roman" w:eastAsia="Times New Roman" w:cs="Times New Roman"/>
+                <w:sz w:val="22"/>
+                <w:szCs w:val="22"/>
+              </w:rPr>
+              <w:t xml:space="preserve">, including antimicrobial resistance and </w:t>
             </w:r>
             <w:r>
               <w:rPr>
@@ -2588,6 +2701,122 @@
                 <w:szCs w:val="22"/>
               </w:rPr>
               <w:t>.</w:t>
+            </w:r>
+          </w:p>
+          <w:p>
+            <w:pPr>
+              <w:spacing w:line="276" w:lineRule="auto"/>
+              <w:rPr>
+                <w:rFonts w:ascii="Times New Roman" w:hAnsi="Times New Roman" w:eastAsia="Times New Roman" w:cs="Times New Roman"/>
+                <w:sz w:val="22"/>
+                <w:szCs w:val="22"/>
+              </w:rPr>
+            </w:pPr>
+          </w:p>
+          <w:p>
+            <w:pPr>
+              <w:spacing w:line="276" w:lineRule="auto"/>
+              <w:rPr>
+                <w:rFonts w:ascii="Times New Roman" w:hAnsi="Times New Roman" w:eastAsia="Times New Roman" w:cs="Times New Roman"/>
+                <w:sz w:val="22"/>
+                <w:szCs w:val="22"/>
+              </w:rPr>
+            </w:pPr>
+            <w:r>
+              <w:rPr>
+                <w:rFonts w:ascii="Times New Roman" w:hAnsi="Times New Roman" w:eastAsia="Times New Roman" w:cs="Times New Roman"/>
+                <w:sz w:val="22"/>
+                <w:szCs w:val="22"/>
+              </w:rPr>
+              <w:t xml:space="preserve">This could also include </w:t>
+            </w:r>
+            <w:r>
+              <w:rPr>
+                <w:rFonts w:ascii="Times New Roman" w:hAnsi="Times New Roman" w:eastAsia="Times New Roman" w:cs="Times New Roman"/>
+                <w:sz w:val="22"/>
+                <w:szCs w:val="22"/>
+              </w:rPr>
+              <w:t xml:space="preserve">planning, developing, and/or delivering </w:t>
+            </w:r>
+            <w:r>
+              <w:rPr>
+                <w:rFonts w:ascii="Times New Roman" w:hAnsi="Times New Roman" w:eastAsia="Times New Roman" w:cs="Times New Roman"/>
+                <w:sz w:val="22"/>
+                <w:szCs w:val="22"/>
+              </w:rPr>
+              <w:t xml:space="preserve">education </w:t>
+            </w:r>
+            <w:r>
+              <w:rPr>
+                <w:rFonts w:ascii="Times New Roman" w:hAnsi="Times New Roman" w:eastAsia="Times New Roman" w:cs="Times New Roman"/>
+                <w:sz w:val="22"/>
+                <w:szCs w:val="22"/>
+              </w:rPr>
+              <w:t xml:space="preserve">to </w:t>
+            </w:r>
+            <w:r>
+              <w:rPr>
+                <w:rFonts w:ascii="Times New Roman" w:hAnsi="Times New Roman" w:eastAsia="Times New Roman" w:cs="Times New Roman"/>
+                <w:sz w:val="22"/>
+                <w:szCs w:val="22"/>
+              </w:rPr>
+              <w:t>t</w:t>
+            </w:r>
+            <w:r>
+              <w:rPr>
+                <w:rFonts w:ascii="Times New Roman" w:hAnsi="Times New Roman" w:eastAsia="Times New Roman" w:cs="Times New Roman"/>
+                <w:sz w:val="22"/>
+                <w:szCs w:val="22"/>
+              </w:rPr>
+              <w:t>rainees</w:t>
+            </w:r>
+            <w:r>
+              <w:rPr>
+                <w:rFonts w:ascii="Times New Roman" w:hAnsi="Times New Roman" w:eastAsia="Times New Roman" w:cs="Times New Roman"/>
+                <w:sz w:val="22"/>
+                <w:szCs w:val="22"/>
+              </w:rPr>
+              <w:t xml:space="preserve"> including residents and fellows</w:t>
+            </w:r>
+            <w:r>
+              <w:rPr>
+                <w:rFonts w:ascii="Times New Roman" w:hAnsi="Times New Roman" w:eastAsia="Times New Roman" w:cs="Times New Roman"/>
+                <w:sz w:val="22"/>
+                <w:szCs w:val="22"/>
+              </w:rPr>
+              <w:t xml:space="preserve"> (</w:t>
+            </w:r>
+            <w:r>
+              <w:rPr>
+                <w:rFonts w:ascii="Times New Roman" w:hAnsi="Times New Roman" w:eastAsia="Times New Roman" w:cs="Times New Roman"/>
+                <w:sz w:val="22"/>
+                <w:szCs w:val="22"/>
+              </w:rPr>
+              <w:t>e.g</w:t>
+            </w:r>
+            <w:r>
+              <w:rPr>
+                <w:rFonts w:ascii="Times New Roman" w:hAnsi="Times New Roman" w:eastAsia="Times New Roman" w:cs="Times New Roman"/>
+                <w:sz w:val="22"/>
+                <w:szCs w:val="22"/>
+              </w:rPr>
+              <w:t xml:space="preserve">, pharmacy, medical, nursing, </w:t>
+            </w:r>
+            <w:r>
+              <w:rPr>
+                <w:rFonts w:ascii="Times New Roman" w:hAnsi="Times New Roman" w:eastAsia="Times New Roman" w:cs="Times New Roman"/>
+                <w:sz w:val="22"/>
+                <w:szCs w:val="22"/>
+              </w:rPr>
+              <w:t>etc</w:t>
+            </w:r>
+            <w:r>
+              <w:rPr>
+                <w:rFonts w:ascii="Times New Roman" w:hAnsi="Times New Roman" w:eastAsia="Times New Roman" w:cs="Times New Roman"/>
+                <w:sz w:val="22"/>
+                <w:szCs w:val="22"/>
+              </w:rPr>
+              <w:t xml:space="preserve">) </w:t>
             </w:r>
           </w:p>
         </w:tc>
@@ -2624,7 +2853,39 @@
                 <w:sz w:val="22"/>
                 <w:szCs w:val="22"/>
               </w:rPr>
-              <w:t xml:space="preserve">Presenting education sessions for clinicians on </w:t>
+              <w:t xml:space="preserve">Presenting education </w:t>
+            </w:r>
+            <w:r>
+              <w:rPr>
+                <w:rFonts w:ascii="Times New Roman" w:hAnsi="Times New Roman" w:eastAsia="Times New Roman" w:cs="Times New Roman"/>
+                <w:sz w:val="22"/>
+                <w:szCs w:val="22"/>
+              </w:rPr>
+              <w:t>(e.g.</w:t>
+            </w:r>
+            <w:r>
+              <w:rPr>
+                <w:rFonts w:ascii="Times New Roman" w:hAnsi="Times New Roman" w:eastAsia="Times New Roman" w:cs="Times New Roman"/>
+                <w:sz w:val="22"/>
+                <w:szCs w:val="22"/>
+              </w:rPr>
+              <w:t xml:space="preserve">, </w:t>
+            </w:r>
+            <w:r>
+              <w:rPr>
+                <w:rFonts w:ascii="Times New Roman" w:hAnsi="Times New Roman" w:eastAsia="Times New Roman" w:cs="Times New Roman"/>
+                <w:sz w:val="22"/>
+                <w:szCs w:val="22"/>
+              </w:rPr>
+              <w:t>on</w:t>
+            </w:r>
+            <w:r>
+              <w:rPr>
+                <w:rFonts w:ascii="Times New Roman" w:hAnsi="Times New Roman" w:eastAsia="Times New Roman" w:cs="Times New Roman"/>
+                <w:sz w:val="22"/>
+                <w:szCs w:val="22"/>
+              </w:rPr>
+              <w:t xml:space="preserve"> </w:t>
             </w:r>
             <w:r>
               <w:rPr>
@@ -2640,7 +2901,39 @@
                 <w:sz w:val="22"/>
                 <w:szCs w:val="22"/>
               </w:rPr>
-              <w:t xml:space="preserve"> antibiotic prescribing.</w:t>
+              <w:t xml:space="preserve"> antibiotic prescribing</w:t>
+            </w:r>
+            <w:r>
+              <w:rPr>
+                <w:rFonts w:ascii="Times New Roman" w:hAnsi="Times New Roman" w:eastAsia="Times New Roman" w:cs="Times New Roman"/>
+                <w:sz w:val="22"/>
+                <w:szCs w:val="22"/>
+              </w:rPr>
+              <w:t xml:space="preserve">, providing information on </w:t>
+            </w:r>
+            <w:r>
+              <w:rPr>
+                <w:rFonts w:ascii="Times New Roman" w:hAnsi="Times New Roman" w:eastAsia="Times New Roman" w:cs="Times New Roman"/>
+                <w:sz w:val="22"/>
+                <w:szCs w:val="22"/>
+              </w:rPr>
+              <w:t xml:space="preserve"> guideline-based antimicrobial therapy</w:t>
+            </w:r>
+            <w:r>
+              <w:rPr>
+                <w:rFonts w:ascii="Times New Roman" w:hAnsi="Times New Roman" w:eastAsia="Times New Roman" w:cs="Times New Roman"/>
+                <w:sz w:val="22"/>
+                <w:szCs w:val="22"/>
+              </w:rPr>
+              <w:t>)</w:t>
+            </w:r>
+            <w:r>
+              <w:rPr>
+                <w:rFonts w:ascii="Times New Roman" w:hAnsi="Times New Roman" w:eastAsia="Times New Roman" w:cs="Times New Roman"/>
+                <w:sz w:val="22"/>
+                <w:szCs w:val="22"/>
+              </w:rPr>
+              <w:t>.</w:t>
             </w:r>
           </w:p>
           <w:p>
@@ -2662,7 +2955,7 @@
                 <w:sz w:val="22"/>
                 <w:szCs w:val="22"/>
               </w:rPr>
-              <w:t>Training prescribers on guideline-based antimicrobial therapy.</w:t>
+              <w:t xml:space="preserve">Activities associated with residency/fellowship </w:t>
             </w:r>
           </w:p>
           <w:p>
@@ -2933,15 +3226,50 @@
                 <w:sz w:val="22"/>
                 <w:szCs w:val="22"/>
               </w:rPr>
-              <w:t xml:space="preserve">Miscellaneous </w:t>
-            </w:r>
-            <w:r>
-              <w:rPr>
-                <w:rFonts w:ascii="Times New Roman" w:hAnsi="Times New Roman" w:eastAsia="Times New Roman" w:cs="Times New Roman"/>
-                <w:sz w:val="22"/>
-                <w:szCs w:val="22"/>
-              </w:rPr>
-              <w:t xml:space="preserve">(Non-ASP time) </w:t>
+              <w:t>Work Interruptions/</w:t>
+            </w:r>
+            <w:r>
+              <w:rPr>
+                <w:rFonts w:ascii="Times New Roman" w:hAnsi="Times New Roman" w:eastAsia="Times New Roman" w:cs="Times New Roman"/>
+                <w:sz w:val="22"/>
+                <w:szCs w:val="22"/>
+              </w:rPr>
+              <w:t xml:space="preserve"> </w:t>
+            </w:r>
+            <w:r>
+              <w:rPr>
+                <w:rFonts w:ascii="Times New Roman" w:hAnsi="Times New Roman" w:eastAsia="Times New Roman" w:cs="Times New Roman"/>
+                <w:sz w:val="22"/>
+                <w:szCs w:val="22"/>
+              </w:rPr>
+              <w:t>Miscellaneous</w:t>
+            </w:r>
+            <w:r>
+              <w:rPr>
+                <w:rFonts w:ascii="Times New Roman" w:hAnsi="Times New Roman" w:eastAsia="Times New Roman" w:cs="Times New Roman"/>
+                <w:sz w:val="22"/>
+                <w:szCs w:val="22"/>
+              </w:rPr>
+              <w:t xml:space="preserve">/ </w:t>
+            </w:r>
+            <w:r>
+              <w:br/>
+            </w:r>
+            <w:r>
+              <w:rPr>
+                <w:rFonts w:ascii="Times New Roman" w:hAnsi="Times New Roman" w:eastAsia="Times New Roman" w:cs="Times New Roman"/>
+                <w:sz w:val="22"/>
+                <w:szCs w:val="22"/>
+              </w:rPr>
+              <w:t>N</w:t>
+            </w:r>
+            <w:r>
+              <w:rPr>
+                <w:rFonts w:ascii="Times New Roman" w:hAnsi="Times New Roman" w:eastAsia="Times New Roman" w:cs="Times New Roman"/>
+                <w:sz w:val="22"/>
+                <w:szCs w:val="22"/>
+              </w:rPr>
+              <w:t>on-ASP time</w:t>
             </w:r>
           </w:p>
         </w:tc>
@@ -2975,7 +3303,23 @@
                 <w:sz w:val="22"/>
                 <w:szCs w:val="22"/>
               </w:rPr>
-              <w:t>Time not attributable to a specific ASP activity, including transit/travel between locations, breaks/meals, and brief administrative downtime</w:t>
+              <w:t xml:space="preserve">Time not </w:t>
+            </w:r>
+            <w:r>
+              <w:rPr>
+                <w:rFonts w:ascii="Times New Roman" w:hAnsi="Times New Roman" w:eastAsia="Times New Roman" w:cs="Times New Roman"/>
+                <w:sz w:val="22"/>
+                <w:szCs w:val="22"/>
+              </w:rPr>
+              <w:t xml:space="preserve">directly </w:t>
+            </w:r>
+            <w:r>
+              <w:rPr>
+                <w:rFonts w:ascii="Times New Roman" w:hAnsi="Times New Roman" w:eastAsia="Times New Roman" w:cs="Times New Roman"/>
+                <w:sz w:val="22"/>
+                <w:szCs w:val="22"/>
+              </w:rPr>
+              <w:t>attributable to a specific ASP activity, including transit/travel between locations, breaks/meals, and brief administrative downtime</w:t>
             </w:r>
           </w:p>
         </w:tc>
@@ -3043,6 +3387,22 @@
         </w:tc>
       </w:tr>
     </w:tbl>
+    <w:p>
+      <w:pPr>
+        <w:spacing w:line="276" w:lineRule="auto"/>
+        <w:rPr>
+          <w:rFonts w:ascii="Times New Roman" w:hAnsi="Times New Roman" w:eastAsia="Times New Roman" w:cs="Times New Roman"/>
+        </w:rPr>
+      </w:pPr>
+    </w:p>
+    <w:p>
+      <w:pPr>
+        <w:spacing w:line="276" w:lineRule="auto"/>
+        <w:rPr>
+          <w:rFonts w:ascii="Times New Roman" w:hAnsi="Times New Roman" w:eastAsia="Times New Roman" w:cs="Times New Roman"/>
+        </w:rPr>
+      </w:pPr>
+    </w:p>
     <w:p>
       <w:pPr>
         <w:spacing w:line="276" w:lineRule="auto"/>
@@ -3169,6 +3529,118 @@
 
 <file path=word/numbering.xml><?xml version="1.0" encoding="utf-8"?>
 <w:numbering xmlns:wpc="http://schemas.microsoft.com/office/word/2010/wordprocessingCanvas" xmlns:cx="http://schemas.microsoft.com/office/drawing/2014/chartex" xmlns:cx1="http://schemas.microsoft.com/office/drawing/2015/9/8/chartex" xmlns:cx2="http://schemas.microsoft.com/office/drawing/2015/10/21/chartex" xmlns:cx3="http://schemas.microsoft.com/office/drawing/2016/5/9/chartex" xmlns:cx4="http://schemas.microsoft.com/office/drawing/2016/5/10/chartex" xmlns:cx5="http://schemas.microsoft.com/office/drawing/2016/5/11/chartex" xmlns:cx6="http://schemas.microsoft.com/office/drawing/2016/5/12/chartex" xmlns:cx7="http://schemas.microsoft.com/office/drawing/2016/5/13/chartex" xmlns:cx8="http://schemas.microsoft.com/office/drawing/2016/5/14/chartex" xmlns:mc="http://schemas.openxmlformats.org/markup-compatibility/2006" xmlns:aink="http://schemas.microsoft.com/office/drawing/2016/ink" xmlns:am3d="http://schemas.microsoft.com/office/drawing/2017/model3d" xmlns:o="urn:schemas-microsoft-com:office:office" xmlns:oel="http://schemas.microsoft.com/office/2019/extlst" xmlns:r="http://schemas.openxmlformats.org/officeDocument/2006/relationships" xmlns:m="http://schemas.openxmlformats.org/officeDocument/2006/math" xmlns:v="urn:schemas-microsoft-com:vml" xmlns:wp14="http://schemas.microsoft.com/office/word/2010/wordprocessingDrawing" xmlns:wp="http://schemas.openxmlformats.org/drawingml/2006/wordprocessingDrawing" xmlns:w10="urn:schemas-microsoft-com:office:word" xmlns:w="http://schemas.openxmlformats.org/wordprocessingml/2006/main" xmlns:w14="http://schemas.microsoft.com/office/word/2010/wordml" xmlns:w15="http://schemas.microsoft.com/office/word/2012/wordml" xmlns:w16cex="http://schemas.microsoft.com/office/word/2018/wordml/cex" xmlns:w16cid="http://schemas.microsoft.com/office/word/2016/wordml/cid" xmlns:w16="http://schemas.microsoft.com/office/word/2018/wordml" xmlns:w16du="http://schemas.microsoft.com/office/word/2023/wordml/word16du" xmlns:w16sdtdh="http://schemas.microsoft.com/office/word/2020/wordml/sdtdatahash" xmlns:w16sdtfl="http://schemas.microsoft.com/office/word/2024/wordml/sdtformatlock" xmlns:w16se="http://schemas.microsoft.com/office/word/2015/wordml/symex" xmlns:wpg="http://schemas.microsoft.com/office/word/2010/wordprocessingGroup" xmlns:wpi="http://schemas.microsoft.com/office/word/2010/wordprocessingInk" xmlns:wne="http://schemas.microsoft.com/office/word/2006/wordml" xmlns:wps="http://schemas.microsoft.com/office/word/2010/wordprocessingShape" mc:Ignorable="w14 w15 w16se w16cid w16 w16cex w16sdtdh w16sdtfl w16du wp14">
+  <w:abstractNum xmlns:w="http://schemas.openxmlformats.org/wordprocessingml/2006/main" w:abstractNumId="20">
+    <w:nsid w:val="36e99bd3"/>
+    <w:multiLevelType xmlns:w="http://schemas.openxmlformats.org/wordprocessingml/2006/main" w:val="hybridMultilevel"/>
+    <w:lvl xmlns:w="http://schemas.openxmlformats.org/wordprocessingml/2006/main" w:ilvl="0">
+      <w:start w:val="1"/>
+      <w:numFmt w:val="bullet"/>
+      <w:lvlText w:val="-"/>
+      <w:lvlJc w:val="left"/>
+      <w:pPr>
+        <w:ind w:left="720" w:hanging="360"/>
+      </w:pPr>
+      <w:rPr>
+        <w:rFonts w:hint="default" w:ascii="Aptos" w:hAnsi="Aptos"/>
+      </w:rPr>
+    </w:lvl>
+    <w:lvl xmlns:w="http://schemas.openxmlformats.org/wordprocessingml/2006/main" w:ilvl="1">
+      <w:start w:val="1"/>
+      <w:numFmt w:val="bullet"/>
+      <w:lvlText w:val="o"/>
+      <w:lvlJc w:val="left"/>
+      <w:pPr>
+        <w:ind w:left="1440" w:hanging="360"/>
+      </w:pPr>
+      <w:rPr>
+        <w:rFonts w:hint="default" w:ascii="Courier New" w:hAnsi="Courier New"/>
+      </w:rPr>
+    </w:lvl>
+    <w:lvl xmlns:w="http://schemas.openxmlformats.org/wordprocessingml/2006/main" w:ilvl="2">
+      <w:start w:val="1"/>
+      <w:numFmt w:val="bullet"/>
+      <w:lvlText w:val=""/>
+      <w:lvlJc w:val="left"/>
+      <w:pPr>
+        <w:ind w:left="2160" w:hanging="360"/>
+      </w:pPr>
+      <w:rPr>
+        <w:rFonts w:hint="default" w:ascii="Wingdings" w:hAnsi="Wingdings"/>
+      </w:rPr>
+    </w:lvl>
+    <w:lvl xmlns:w="http://schemas.openxmlformats.org/wordprocessingml/2006/main" w:ilvl="3">
+      <w:start w:val="1"/>
+      <w:numFmt w:val="bullet"/>
+      <w:lvlText w:val=""/>
+      <w:lvlJc w:val="left"/>
+      <w:pPr>
+        <w:ind w:left="2880" w:hanging="360"/>
+      </w:pPr>
+      <w:rPr>
+        <w:rFonts w:hint="default" w:ascii="Symbol" w:hAnsi="Symbol"/>
+      </w:rPr>
+    </w:lvl>
+    <w:lvl xmlns:w="http://schemas.openxmlformats.org/wordprocessingml/2006/main" w:ilvl="4">
+      <w:start w:val="1"/>
+      <w:numFmt w:val="bullet"/>
+      <w:lvlText w:val="o"/>
+      <w:lvlJc w:val="left"/>
+      <w:pPr>
+        <w:ind w:left="3600" w:hanging="360"/>
+      </w:pPr>
+      <w:rPr>
+        <w:rFonts w:hint="default" w:ascii="Courier New" w:hAnsi="Courier New"/>
+      </w:rPr>
+    </w:lvl>
+    <w:lvl xmlns:w="http://schemas.openxmlformats.org/wordprocessingml/2006/main" w:ilvl="5">
+      <w:start w:val="1"/>
+      <w:numFmt w:val="bullet"/>
+      <w:lvlText w:val=""/>
+      <w:lvlJc w:val="left"/>
+      <w:pPr>
+        <w:ind w:left="4320" w:hanging="360"/>
+      </w:pPr>
+      <w:rPr>
+        <w:rFonts w:hint="default" w:ascii="Wingdings" w:hAnsi="Wingdings"/>
+      </w:rPr>
+    </w:lvl>
+    <w:lvl xmlns:w="http://schemas.openxmlformats.org/wordprocessingml/2006/main" w:ilvl="6">
+      <w:start w:val="1"/>
+      <w:numFmt w:val="bullet"/>
+      <w:lvlText w:val=""/>
+      <w:lvlJc w:val="left"/>
+      <w:pPr>
+        <w:ind w:left="5040" w:hanging="360"/>
+      </w:pPr>
+      <w:rPr>
+        <w:rFonts w:hint="default" w:ascii="Symbol" w:hAnsi="Symbol"/>
+      </w:rPr>
+    </w:lvl>
+    <w:lvl xmlns:w="http://schemas.openxmlformats.org/wordprocessingml/2006/main" w:ilvl="7">
+      <w:start w:val="1"/>
+      <w:numFmt w:val="bullet"/>
+      <w:lvlText w:val="o"/>
+      <w:lvlJc w:val="left"/>
+      <w:pPr>
+        <w:ind w:left="5760" w:hanging="360"/>
+      </w:pPr>
+      <w:rPr>
+        <w:rFonts w:hint="default" w:ascii="Courier New" w:hAnsi="Courier New"/>
+      </w:rPr>
+    </w:lvl>
+    <w:lvl xmlns:w="http://schemas.openxmlformats.org/wordprocessingml/2006/main" w:ilvl="8">
+      <w:start w:val="1"/>
+      <w:numFmt w:val="bullet"/>
+      <w:lvlText w:val=""/>
+      <w:lvlJc w:val="left"/>
+      <w:pPr>
+        <w:ind w:left="6480" w:hanging="360"/>
+      </w:pPr>
+      <w:rPr>
+        <w:rFonts w:hint="default" w:ascii="Wingdings" w:hAnsi="Wingdings"/>
+      </w:rPr>
+    </w:lvl>
+  </w:abstractNum>
   <w:abstractNum w:abstractNumId="0" w15:restartNumberingAfterBreak="0">
     <w:nsid w:val="00B10C08"/>
     <w:multiLevelType w:val="hybridMultilevel"/>
@@ -5321,6 +5793,9 @@
       </w:rPr>
     </w:lvl>
   </w:abstractNum>
+  <w:num w:numId="21">
+    <w:abstractNumId w:val="20"/>
+  </w:num>
   <w:num w:numId="1" w16cid:durableId="1024788018">
     <w:abstractNumId w:val="10"/>
   </w:num>

</xml_diff>

<commit_message>
About: steering committee roster, roles, bios; contact page design; appendices table wrap
- Steering committee: full list with Organization/Contact, Kelly & Star detail fields
- Contact: professional layout, remove placeholder form, dark styling
- Appendices: docx table word-wrap, last-column min-width, wider container
- Quick Log / History: tele-health No label simplified; typical day unchanged

Made-with: Cursor
</commit_message>
<xml_diff>
--- a/public/Appendices List.docx
+++ b/public/Appendices List.docx
@@ -72,9 +72,9 @@
         <w:tblLook w:val="04A0" w:firstRow="1" w:lastRow="0" w:firstColumn="1" w:lastColumn="0" w:noHBand="0" w:noVBand="1"/>
       </w:tblPr>
       <w:tblGrid>
-        <w:gridCol w:w="2102"/>
-        <w:gridCol w:w="3334"/>
-        <w:gridCol w:w="3904"/>
+        <w:gridCol w:w="1988"/>
+        <w:gridCol w:w="3402"/>
+        <w:gridCol w:w="3780"/>
       </w:tblGrid>
       <w:tr>
         <w:trPr>
@@ -82,7 +82,7 @@
         </w:trPr>
         <w:tc>
           <w:tcPr>
-            <w:tcW w:w="1950" w:type="dxa"/>
+            <w:tcW w:w="1988" w:type="dxa"/>
             <w:tcBorders>
               <w:top w:val="single" w:sz="8" w:space="0" w:color="auto"/>
               <w:left w:val="single" w:sz="8" w:space="0" w:color="auto"/>
@@ -115,7 +115,7 @@
         </w:tc>
         <w:tc>
           <w:tcPr>
-            <w:tcW w:w="4350" w:type="dxa"/>
+            <w:tcW w:w="3402" w:type="dxa"/>
             <w:tcBorders>
               <w:top w:val="single" w:sz="8" w:space="0" w:color="auto"/>
               <w:left w:val="single" w:sz="8" w:space="0" w:color="auto"/>
@@ -148,7 +148,7 @@
         </w:tc>
         <w:tc>
           <w:tcPr>
-            <w:tcW w:w="4320" w:type="dxa"/>
+            <w:tcW w:w="3780" w:type="dxa"/>
             <w:tcBorders>
               <w:top w:val="single" w:sz="8" w:space="0" w:color="auto"/>
               <w:left w:val="single" w:sz="8" w:space="0" w:color="auto"/>
@@ -187,7 +187,7 @@
         </w:trPr>
         <w:tc>
           <w:tcPr>
-            <w:tcW w:w="1950" w:type="dxa"/>
+            <w:tcW w:w="1988" w:type="dxa"/>
             <w:tcBorders>
               <w:top w:val="single" w:sz="8" w:space="0" w:color="auto"/>
               <w:left w:val="single" w:sz="8" w:space="0" w:color="auto"/>
@@ -220,7 +220,7 @@
         </w:tc>
         <w:tc>
           <w:tcPr>
-            <w:tcW w:w="4350" w:type="dxa"/>
+            <w:tcW w:w="3402" w:type="dxa"/>
             <w:tcBorders>
               <w:top w:val="single" w:sz="8" w:space="0" w:color="auto"/>
               <w:left w:val="single" w:sz="8" w:space="0" w:color="auto"/>
@@ -261,7 +261,7 @@
         </w:tc>
         <w:tc>
           <w:tcPr>
-            <w:tcW w:w="4320" w:type="dxa"/>
+            <w:tcW w:w="3780" w:type="dxa"/>
             <w:tcBorders>
               <w:top w:val="single" w:sz="8" w:space="0" w:color="auto"/>
               <w:left w:val="single" w:sz="8" w:space="0" w:color="auto"/>
@@ -434,7 +434,7 @@
         </w:trPr>
         <w:tc>
           <w:tcPr>
-            <w:tcW w:w="1950" w:type="dxa"/>
+            <w:tcW w:w="1988" w:type="dxa"/>
             <w:tcBorders>
               <w:top w:val="single" w:sz="8" w:space="0" w:color="auto"/>
               <w:left w:val="single" w:sz="8" w:space="0" w:color="auto"/>
@@ -467,7 +467,7 @@
         </w:tc>
         <w:tc>
           <w:tcPr>
-            <w:tcW w:w="4350" w:type="dxa"/>
+            <w:tcW w:w="3402" w:type="dxa"/>
             <w:tcBorders>
               <w:top w:val="single" w:sz="8" w:space="0" w:color="auto"/>
               <w:left w:val="single" w:sz="8" w:space="0" w:color="auto"/>
@@ -500,7 +500,7 @@
         </w:tc>
         <w:tc>
           <w:tcPr>
-            <w:tcW w:w="4320" w:type="dxa"/>
+            <w:tcW w:w="3780" w:type="dxa"/>
             <w:tcBorders>
               <w:top w:val="single" w:sz="8" w:space="0" w:color="auto"/>
               <w:left w:val="single" w:sz="8" w:space="0" w:color="auto"/>
@@ -589,7 +589,7 @@
         </w:trPr>
         <w:tc>
           <w:tcPr>
-            <w:tcW w:w="1950" w:type="dxa"/>
+            <w:tcW w:w="1988" w:type="dxa"/>
             <w:tcBorders>
               <w:top w:val="single" w:sz="8" w:space="0" w:color="auto"/>
               <w:left w:val="single" w:sz="8" w:space="0" w:color="auto"/>
@@ -622,7 +622,7 @@
         </w:tc>
         <w:tc>
           <w:tcPr>
-            <w:tcW w:w="4350" w:type="dxa"/>
+            <w:tcW w:w="3402" w:type="dxa"/>
             <w:tcBorders>
               <w:top w:val="single" w:sz="8" w:space="0" w:color="auto"/>
               <w:left w:val="single" w:sz="8" w:space="0" w:color="auto"/>
@@ -655,7 +655,7 @@
         </w:tc>
         <w:tc>
           <w:tcPr>
-            <w:tcW w:w="4320" w:type="dxa"/>
+            <w:tcW w:w="3780" w:type="dxa"/>
             <w:tcBorders>
               <w:top w:val="single" w:sz="8" w:space="0" w:color="auto"/>
               <w:left w:val="single" w:sz="8" w:space="0" w:color="auto"/>
@@ -698,7 +698,7 @@
         </w:trPr>
         <w:tc>
           <w:tcPr>
-            <w:tcW w:w="1950" w:type="dxa"/>
+            <w:tcW w:w="1988" w:type="dxa"/>
             <w:tcBorders>
               <w:top w:val="single" w:sz="8" w:space="0" w:color="auto"/>
               <w:left w:val="single" w:sz="8" w:space="0" w:color="auto"/>
@@ -731,7 +731,7 @@
         </w:tc>
         <w:tc>
           <w:tcPr>
-            <w:tcW w:w="4350" w:type="dxa"/>
+            <w:tcW w:w="3402" w:type="dxa"/>
             <w:tcBorders>
               <w:top w:val="single" w:sz="8" w:space="0" w:color="auto"/>
               <w:left w:val="single" w:sz="8" w:space="0" w:color="auto"/>
@@ -764,7 +764,7 @@
         </w:tc>
         <w:tc>
           <w:tcPr>
-            <w:tcW w:w="4320" w:type="dxa"/>
+            <w:tcW w:w="3780" w:type="dxa"/>
             <w:tcBorders>
               <w:top w:val="single" w:sz="8" w:space="0" w:color="auto"/>
               <w:left w:val="single" w:sz="8" w:space="0" w:color="auto"/>
@@ -874,7 +874,7 @@
         </w:trPr>
         <w:tc>
           <w:tcPr>
-            <w:tcW w:w="1950" w:type="dxa"/>
+            <w:tcW w:w="1988" w:type="dxa"/>
             <w:tcBorders>
               <w:top w:val="single" w:sz="8" w:space="0" w:color="auto"/>
               <w:left w:val="single" w:sz="8" w:space="0" w:color="auto"/>
@@ -907,7 +907,7 @@
         </w:tc>
         <w:tc>
           <w:tcPr>
-            <w:tcW w:w="4350" w:type="dxa"/>
+            <w:tcW w:w="3402" w:type="dxa"/>
             <w:tcBorders>
               <w:top w:val="single" w:sz="8" w:space="0" w:color="auto"/>
               <w:left w:val="single" w:sz="8" w:space="0" w:color="auto"/>
@@ -940,7 +940,7 @@
         </w:tc>
         <w:tc>
           <w:tcPr>
-            <w:tcW w:w="4320" w:type="dxa"/>
+            <w:tcW w:w="3780" w:type="dxa"/>
             <w:tcBorders>
               <w:top w:val="single" w:sz="8" w:space="0" w:color="auto"/>
               <w:left w:val="single" w:sz="8" w:space="0" w:color="auto"/>
@@ -1006,7 +1006,7 @@
         </w:trPr>
         <w:tc>
           <w:tcPr>
-            <w:tcW w:w="1950" w:type="dxa"/>
+            <w:tcW w:w="1988" w:type="dxa"/>
             <w:tcBorders>
               <w:top w:val="single" w:sz="8" w:space="0" w:color="auto"/>
               <w:left w:val="single" w:sz="8" w:space="0" w:color="auto"/>
@@ -1039,7 +1039,7 @@
         </w:tc>
         <w:tc>
           <w:tcPr>
-            <w:tcW w:w="4350" w:type="dxa"/>
+            <w:tcW w:w="3402" w:type="dxa"/>
             <w:tcBorders>
               <w:top w:val="single" w:sz="8" w:space="0" w:color="auto"/>
               <w:left w:val="single" w:sz="8" w:space="0" w:color="auto"/>
@@ -1072,7 +1072,7 @@
         </w:tc>
         <w:tc>
           <w:tcPr>
-            <w:tcW w:w="4320" w:type="dxa"/>
+            <w:tcW w:w="3780" w:type="dxa"/>
             <w:tcBorders>
               <w:top w:val="single" w:sz="8" w:space="0" w:color="auto"/>
               <w:left w:val="single" w:sz="8" w:space="0" w:color="auto"/>
@@ -1138,7 +1138,7 @@
         </w:trPr>
         <w:tc>
           <w:tcPr>
-            <w:tcW w:w="1950" w:type="dxa"/>
+            <w:tcW w:w="1988" w:type="dxa"/>
             <w:tcBorders>
               <w:top w:val="single" w:sz="8" w:space="0" w:color="auto"/>
               <w:left w:val="single" w:sz="8" w:space="0" w:color="auto"/>
@@ -1171,7 +1171,7 @@
         </w:tc>
         <w:tc>
           <w:tcPr>
-            <w:tcW w:w="4350" w:type="dxa"/>
+            <w:tcW w:w="3402" w:type="dxa"/>
             <w:tcBorders>
               <w:top w:val="single" w:sz="8" w:space="0" w:color="auto"/>
               <w:left w:val="single" w:sz="8" w:space="0" w:color="auto"/>
@@ -1204,7 +1204,7 @@
         </w:tc>
         <w:tc>
           <w:tcPr>
-            <w:tcW w:w="4320" w:type="dxa"/>
+            <w:tcW w:w="3780" w:type="dxa"/>
             <w:tcBorders>
               <w:top w:val="single" w:sz="8" w:space="0" w:color="auto"/>
               <w:left w:val="single" w:sz="8" w:space="0" w:color="auto"/>
@@ -1279,7 +1279,7 @@
         </w:trPr>
         <w:tc>
           <w:tcPr>
-            <w:tcW w:w="1950" w:type="dxa"/>
+            <w:tcW w:w="1988" w:type="dxa"/>
             <w:tcBorders>
               <w:top w:val="single" w:sz="8" w:space="0" w:color="auto"/>
               <w:left w:val="single" w:sz="8" w:space="0" w:color="auto"/>
@@ -1313,7 +1313,7 @@
         </w:tc>
         <w:tc>
           <w:tcPr>
-            <w:tcW w:w="4350" w:type="dxa"/>
+            <w:tcW w:w="3402" w:type="dxa"/>
             <w:tcBorders>
               <w:top w:val="single" w:sz="8" w:space="0" w:color="auto"/>
               <w:left w:val="single" w:sz="8" w:space="0" w:color="auto"/>
@@ -1346,7 +1346,7 @@
         </w:tc>
         <w:tc>
           <w:tcPr>
-            <w:tcW w:w="4320" w:type="dxa"/>
+            <w:tcW w:w="3780" w:type="dxa"/>
             <w:tcBorders>
               <w:top w:val="single" w:sz="8" w:space="0" w:color="auto"/>
               <w:left w:val="single" w:sz="8" w:space="0" w:color="auto"/>
@@ -1412,7 +1412,7 @@
         </w:trPr>
         <w:tc>
           <w:tcPr>
-            <w:tcW w:w="1950" w:type="dxa"/>
+            <w:tcW w:w="1988" w:type="dxa"/>
             <w:tcBorders>
               <w:top w:val="single" w:sz="8" w:space="0" w:color="auto"/>
               <w:left w:val="single" w:sz="8" w:space="0" w:color="auto"/>
@@ -1445,7 +1445,7 @@
         </w:tc>
         <w:tc>
           <w:tcPr>
-            <w:tcW w:w="4350" w:type="dxa"/>
+            <w:tcW w:w="3402" w:type="dxa"/>
             <w:tcBorders>
               <w:top w:val="single" w:sz="8" w:space="0" w:color="auto"/>
               <w:left w:val="single" w:sz="8" w:space="0" w:color="auto"/>
@@ -1476,7 +1476,7 @@
         </w:tc>
         <w:tc>
           <w:tcPr>
-            <w:tcW w:w="4320" w:type="dxa"/>
+            <w:tcW w:w="3780" w:type="dxa"/>
             <w:tcBorders>
               <w:top w:val="single" w:sz="8" w:space="0" w:color="auto"/>
               <w:left w:val="single" w:sz="8" w:space="0" w:color="auto"/>
@@ -1542,7 +1542,7 @@
         </w:trPr>
         <w:tc>
           <w:tcPr>
-            <w:tcW w:w="1950" w:type="dxa"/>
+            <w:tcW w:w="1988" w:type="dxa"/>
             <w:tcBorders>
               <w:top w:val="single" w:sz="8" w:space="0" w:color="auto"/>
               <w:left w:val="single" w:sz="8" w:space="0" w:color="auto"/>
@@ -1575,7 +1575,7 @@
         </w:tc>
         <w:tc>
           <w:tcPr>
-            <w:tcW w:w="4350" w:type="dxa"/>
+            <w:tcW w:w="3402" w:type="dxa"/>
             <w:tcBorders>
               <w:top w:val="single" w:sz="8" w:space="0" w:color="auto"/>
               <w:left w:val="single" w:sz="8" w:space="0" w:color="auto"/>
@@ -1608,7 +1608,7 @@
         </w:tc>
         <w:tc>
           <w:tcPr>
-            <w:tcW w:w="4320" w:type="dxa"/>
+            <w:tcW w:w="3780" w:type="dxa"/>
             <w:tcBorders>
               <w:top w:val="single" w:sz="8" w:space="0" w:color="auto"/>
               <w:left w:val="single" w:sz="8" w:space="0" w:color="auto"/>
@@ -1720,7 +1720,7 @@
         </w:trPr>
         <w:tc>
           <w:tcPr>
-            <w:tcW w:w="1950" w:type="dxa"/>
+            <w:tcW w:w="1988" w:type="dxa"/>
             <w:tcBorders>
               <w:top w:val="single" w:sz="8" w:space="0" w:color="auto"/>
               <w:left w:val="single" w:sz="8" w:space="0" w:color="auto"/>
@@ -1753,7 +1753,7 @@
         </w:tc>
         <w:tc>
           <w:tcPr>
-            <w:tcW w:w="4350" w:type="dxa"/>
+            <w:tcW w:w="3402" w:type="dxa"/>
             <w:tcBorders>
               <w:top w:val="single" w:sz="8" w:space="0" w:color="auto"/>
               <w:left w:val="single" w:sz="8" w:space="0" w:color="auto"/>
@@ -1786,7 +1786,7 @@
         </w:tc>
         <w:tc>
           <w:tcPr>
-            <w:tcW w:w="4320" w:type="dxa"/>
+            <w:tcW w:w="3780" w:type="dxa"/>
             <w:tcBorders>
               <w:top w:val="single" w:sz="8" w:space="0" w:color="auto"/>
               <w:left w:val="single" w:sz="8" w:space="0" w:color="auto"/>
@@ -1852,7 +1852,7 @@
         </w:trPr>
         <w:tc>
           <w:tcPr>
-            <w:tcW w:w="1950" w:type="dxa"/>
+            <w:tcW w:w="1988" w:type="dxa"/>
             <w:tcBorders>
               <w:top w:val="single" w:sz="8" w:space="0" w:color="auto"/>
               <w:left w:val="single" w:sz="8" w:space="0" w:color="auto"/>
@@ -1885,7 +1885,7 @@
         </w:tc>
         <w:tc>
           <w:tcPr>
-            <w:tcW w:w="4350" w:type="dxa"/>
+            <w:tcW w:w="3402" w:type="dxa"/>
             <w:tcBorders>
               <w:top w:val="single" w:sz="8" w:space="0" w:color="auto"/>
               <w:left w:val="single" w:sz="8" w:space="0" w:color="auto"/>
@@ -1934,7 +1934,7 @@
         </w:tc>
         <w:tc>
           <w:tcPr>
-            <w:tcW w:w="4320" w:type="dxa"/>
+            <w:tcW w:w="3780" w:type="dxa"/>
             <w:tcBorders>
               <w:top w:val="single" w:sz="8" w:space="0" w:color="auto"/>
               <w:left w:val="single" w:sz="8" w:space="0" w:color="auto"/>
@@ -2046,7 +2046,7 @@
         </w:trPr>
         <w:tc>
           <w:tcPr>
-            <w:tcW w:w="1950" w:type="dxa"/>
+            <w:tcW w:w="1988" w:type="dxa"/>
             <w:tcBorders>
               <w:top w:val="single" w:sz="8" w:space="0" w:color="auto"/>
               <w:left w:val="single" w:sz="8" w:space="0" w:color="auto"/>
@@ -2079,7 +2079,7 @@
         </w:tc>
         <w:tc>
           <w:tcPr>
-            <w:tcW w:w="4350" w:type="dxa"/>
+            <w:tcW w:w="3402" w:type="dxa"/>
             <w:tcBorders>
               <w:top w:val="single" w:sz="8" w:space="0" w:color="auto"/>
               <w:left w:val="single" w:sz="8" w:space="0" w:color="auto"/>
@@ -2112,7 +2112,7 @@
         </w:tc>
         <w:tc>
           <w:tcPr>
-            <w:tcW w:w="4320" w:type="dxa"/>
+            <w:tcW w:w="3780" w:type="dxa"/>
             <w:tcBorders>
               <w:top w:val="single" w:sz="8" w:space="0" w:color="auto"/>
               <w:left w:val="single" w:sz="8" w:space="0" w:color="auto"/>
@@ -2155,7 +2155,7 @@
         </w:trPr>
         <w:tc>
           <w:tcPr>
-            <w:tcW w:w="1950" w:type="dxa"/>
+            <w:tcW w:w="1988" w:type="dxa"/>
             <w:tcBorders>
               <w:top w:val="single" w:sz="8" w:space="0" w:color="auto"/>
               <w:left w:val="single" w:sz="8" w:space="0" w:color="auto"/>
@@ -2189,7 +2189,7 @@
         </w:tc>
         <w:tc>
           <w:tcPr>
-            <w:tcW w:w="4350" w:type="dxa"/>
+            <w:tcW w:w="3402" w:type="dxa"/>
             <w:tcBorders>
               <w:top w:val="single" w:sz="8" w:space="0" w:color="auto"/>
               <w:left w:val="single" w:sz="8" w:space="0" w:color="auto"/>
@@ -2238,7 +2238,7 @@
         </w:tc>
         <w:tc>
           <w:tcPr>
-            <w:tcW w:w="4320" w:type="dxa"/>
+            <w:tcW w:w="3780" w:type="dxa"/>
             <w:tcBorders>
               <w:top w:val="single" w:sz="8" w:space="0" w:color="auto"/>
               <w:left w:val="single" w:sz="8" w:space="0" w:color="auto"/>
@@ -2304,7 +2304,7 @@
         </w:trPr>
         <w:tc>
           <w:tcPr>
-            <w:tcW w:w="1950" w:type="dxa"/>
+            <w:tcW w:w="1988" w:type="dxa"/>
             <w:tcBorders>
               <w:top w:val="single" w:sz="8" w:space="0" w:color="auto"/>
               <w:left w:val="single" w:sz="8" w:space="0" w:color="auto"/>
@@ -2345,7 +2345,7 @@
         </w:tc>
         <w:tc>
           <w:tcPr>
-            <w:tcW w:w="4350" w:type="dxa"/>
+            <w:tcW w:w="3402" w:type="dxa"/>
             <w:tcBorders>
               <w:top w:val="single" w:sz="8" w:space="0" w:color="auto"/>
               <w:left w:val="single" w:sz="8" w:space="0" w:color="auto"/>
@@ -2518,7 +2518,7 @@
         </w:tc>
         <w:tc>
           <w:tcPr>
-            <w:tcW w:w="4320" w:type="dxa"/>
+            <w:tcW w:w="3780" w:type="dxa"/>
             <w:tcBorders>
               <w:top w:val="single" w:sz="8" w:space="0" w:color="auto"/>
               <w:left w:val="single" w:sz="8" w:space="0" w:color="auto"/>
@@ -2670,7 +2670,7 @@
         </w:trPr>
         <w:tc>
           <w:tcPr>
-            <w:tcW w:w="1950" w:type="dxa"/>
+            <w:tcW w:w="1988" w:type="dxa"/>
             <w:tcBorders>
               <w:top w:val="single" w:sz="8" w:space="0" w:color="auto"/>
               <w:left w:val="single" w:sz="8" w:space="0" w:color="auto"/>
@@ -2703,7 +2703,7 @@
         </w:tc>
         <w:tc>
           <w:tcPr>
-            <w:tcW w:w="4350" w:type="dxa"/>
+            <w:tcW w:w="3402" w:type="dxa"/>
             <w:tcBorders>
               <w:top w:val="single" w:sz="8" w:space="0" w:color="auto"/>
               <w:left w:val="single" w:sz="8" w:space="0" w:color="auto"/>
@@ -2736,7 +2736,7 @@
         </w:tc>
         <w:tc>
           <w:tcPr>
-            <w:tcW w:w="4320" w:type="dxa"/>
+            <w:tcW w:w="3780" w:type="dxa"/>
             <w:tcBorders>
               <w:top w:val="single" w:sz="8" w:space="0" w:color="auto"/>
               <w:left w:val="single" w:sz="8" w:space="0" w:color="auto"/>
@@ -2848,7 +2848,7 @@
         </w:trPr>
         <w:tc>
           <w:tcPr>
-            <w:tcW w:w="2173" w:type="dxa"/>
+            <w:tcW w:w="1988" w:type="dxa"/>
             <w:tcBorders>
               <w:top w:val="single" w:sz="8" w:space="0" w:color="auto"/>
               <w:left w:val="single" w:sz="8" w:space="0" w:color="auto"/>
@@ -2934,7 +2934,7 @@
         </w:tc>
         <w:tc>
           <w:tcPr>
-            <w:tcW w:w="3260" w:type="dxa"/>
+            <w:tcW w:w="3402" w:type="dxa"/>
             <w:tcBorders>
               <w:top w:val="single" w:sz="8" w:space="0" w:color="auto"/>
               <w:left w:val="single" w:sz="8" w:space="0" w:color="auto"/>
@@ -2983,7 +2983,7 @@
         </w:tc>
         <w:tc>
           <w:tcPr>
-            <w:tcW w:w="3907" w:type="dxa"/>
+            <w:tcW w:w="3780" w:type="dxa"/>
             <w:tcBorders>
               <w:top w:val="single" w:sz="8" w:space="0" w:color="auto"/>
               <w:left w:val="single" w:sz="8" w:space="0" w:color="auto"/>

</xml_diff>